<commit_message>
docs: correct L2 submission headers
</commit_message>
<xml_diff>
--- a/docs/proposals/utc-health-category/health-related-emoji-coverage-l2-submission.docx
+++ b/docs/proposals/utc-health-category/health-related-emoji-coverage-l2-submission.docx
@@ -45,7 +45,16 @@
         <w:rPr>
           <w:rStyle w:val="VerbatimChar"/>
         </w:rPr>
-        <w:t xml:space="preserve">Action: Refer to the Emoji Standard &amp; Research Working Group for review and recommendation</w:t>
+        <w:t xml:space="preserve">Action: Refer to the Emoji Standard &amp; Research Working Group</w:t>
+      </w:r>
+      <w:r>
+        <w:br/>
+      </w:r>
+      <w:r>
+        <w:rPr>
+          <w:rStyle w:val="VerbatimChar"/>
+        </w:rPr>
+        <w:t xml:space="preserve">        for review and recommendation</w:t>
       </w:r>
     </w:p>
     <w:bookmarkStart w:id="9" w:name="summary"/>

</xml_diff>

<commit_message>
docs: humanize L2 submission
</commit_message>
<xml_diff>
--- a/docs/proposals/utc-health-category/health-related-emoji-coverage-l2-submission.docx
+++ b/docs/proposals/utc-health-category/health-related-emoji-coverage-l2-submission.docx
@@ -71,25 +71,19 @@
         <w:pStyle w:val="FirstParagraph"/>
       </w:pPr>
       <w:r>
-        <w:t xml:space="preserve">Health-related emoji appear across anatomy, diagnostics, laboratory science, medication, emergency care,</w:t>
-      </w:r>
-      <w:r>
-        <w:t xml:space="preserve"> </w:t>
-      </w:r>
-      <w:r>
-        <w:t xml:space="preserve">and clinical equipment. Individual proposals are reviewed one at a time, but they often raise the same</w:t>
-      </w:r>
-      <w:r>
-        <w:t xml:space="preserve"> </w:t>
-      </w:r>
-      <w:r>
-        <w:t xml:space="preserve">questions: whether an existing emoji is an adequate substitute, whether two concepts are visually distinct,</w:t>
-      </w:r>
-      <w:r>
-        <w:t xml:space="preserve"> </w:t>
-      </w:r>
-      <w:r>
-        <w:t xml:space="preserve">whether expected usage is broad enough, and whether one proposal would lead to an open-ended set.</w:t>
+        <w:t xml:space="preserve">Unicode already includes health-related emoji across anatomy, diagnostics, laboratory science, medication,</w:t>
+      </w:r>
+      <w:r>
+        <w:t xml:space="preserve"> </w:t>
+      </w:r>
+      <w:r>
+        <w:t xml:space="preserve">emergency care, and clinical equipment. Proposals are reviewed individually, but the same practical questions</w:t>
+      </w:r>
+      <w:r>
+        <w:t xml:space="preserve"> </w:t>
+      </w:r>
+      <w:r>
+        <w:t xml:space="preserve">recur: adequacy of substitutes, visual distinction at emoji size, expected usage, and open-endedness.</w:t>
       </w:r>
     </w:p>
     <w:p>
@@ -97,25 +91,31 @@
         <w:pStyle w:val="BodyText"/>
       </w:pPr>
       <w:r>
-        <w:t xml:space="preserve">We ask the Unicode Technical Committee to refer these recurring questions to the Emoji Standard &amp; Research</w:t>
-      </w:r>
-      <w:r>
-        <w:t xml:space="preserve"> </w:t>
-      </w:r>
-      <w:r>
-        <w:t xml:space="preserve">Working Group. The review would examine how existing health-related emoji are represented and found, and</w:t>
-      </w:r>
-      <w:r>
-        <w:t xml:space="preserve"> </w:t>
-      </w:r>
-      <w:r>
-        <w:t xml:space="preserve">whether the current proposal guidance gives enough direction for closely related medical concepts. Every new</w:t>
-      </w:r>
-      <w:r>
-        <w:t xml:space="preserve"> </w:t>
-      </w:r>
-      <w:r>
-        <w:t xml:space="preserve">emoji would continue to require its own complete submission through the official Emoji Submission Form.</w:t>
+        <w:t xml:space="preserve">We ask the Unicode Technical Committee (UTC) to refer these issues to the Emoji Standard &amp; Research Working</w:t>
+      </w:r>
+      <w:r>
+        <w:t xml:space="preserve"> </w:t>
+      </w:r>
+      <w:r>
+        <w:t xml:space="preserve">Group (ESR). ESR could examine how easily users can find existing health-related emoji and whether the</w:t>
+      </w:r>
+      <w:r>
+        <w:t xml:space="preserve"> </w:t>
+      </w:r>
+      <w:r>
+        <w:t xml:space="preserve">published guidance adequately addresses medically distinct but visually similar concepts. A referral would not</w:t>
+      </w:r>
+      <w:r>
+        <w:t xml:space="preserve"> </w:t>
+      </w:r>
+      <w:r>
+        <w:t xml:space="preserve">change the proposal process. Every new emoji would still require a complete submission through the official</w:t>
+      </w:r>
+      <w:r>
+        <w:t xml:space="preserve"> </w:t>
+      </w:r>
+      <w:r>
+        <w:t xml:space="preserve">Emoji Submission Form.</w:t>
       </w:r>
     </w:p>
     <w:bookmarkEnd w:id="9"/>
@@ -137,13 +137,13 @@
         </w:numPr>
       </w:pPr>
       <w:r>
-        <w:t xml:space="preserve">Would a review of related health emoji help ESR assess existing substitutes and closely related proposals</w:t>
-      </w:r>
-      <w:r>
-        <w:t xml:space="preserve"> </w:t>
-      </w:r>
-      <w:r>
-        <w:t xml:space="preserve">more consistently?</w:t>
+        <w:t xml:space="preserve">Would considering related health emoji together help ESR assess existing substitutes and closely related</w:t>
+      </w:r>
+      <w:r>
+        <w:t xml:space="preserve"> </w:t>
+      </w:r>
+      <w:r>
+        <w:t xml:space="preserve">proposals more consistently?</w:t>
       </w:r>
     </w:p>
     <w:p>
@@ -155,13 +155,13 @@
         </w:numPr>
       </w:pPr>
       <w:r>
-        <w:t xml:space="preserve">Are common health-related emoji easy to find through their current names, keywords, ordering, and vendor</w:t>
-      </w:r>
-      <w:r>
-        <w:t xml:space="preserve"> </w:t>
-      </w:r>
-      <w:r>
-        <w:t xml:space="preserve">keyboard layouts? If not, which standards or platform group should address the problem?</w:t>
+        <w:t xml:space="preserve">Can users readily find common health-related emoji by name, keyword, ordering, or vendor keyboard placement?</w:t>
+      </w:r>
+      <w:r>
+        <w:t xml:space="preserve"> </w:t>
+      </w:r>
+      <w:r>
+        <w:t xml:space="preserve">If not, which standards body or platform team should address the problem?</w:t>
       </w:r>
     </w:p>
     <w:p>
@@ -173,13 +173,13 @@
         </w:numPr>
       </w:pPr>
       <w:r>
-        <w:t xml:space="preserve">Does the published guidance give enough direction for concepts that are medically distinct but visually</w:t>
-      </w:r>
-      <w:r>
-        <w:t xml:space="preserve"> </w:t>
-      </w:r>
-      <w:r>
-        <w:t xml:space="preserve">related, such as Blood Bag and IV Bag or Pill Box and Pill Pack?</w:t>
+        <w:t xml:space="preserve">Does the published guidance adequately address concepts that are medically distinct but may look similar at</w:t>
+      </w:r>
+      <w:r>
+        <w:t xml:space="preserve"> </w:t>
+      </w:r>
+      <w:r>
+        <w:t xml:space="preserve">emoji size, such as Blood Bag and IV Bag or Pill Box and Pill Pack?</w:t>
       </w:r>
     </w:p>
     <w:p>
@@ -191,13 +191,13 @@
         </w:numPr>
       </w:pPr>
       <w:r>
-        <w:t xml:space="preserve">Would a short public note on recognition at small sizes, black-and-white legibility, and category-completion</w:t>
-      </w:r>
-      <w:r>
-        <w:t xml:space="preserve"> </w:t>
-      </w:r>
-      <w:r>
-        <w:t xml:space="preserve">arguments help submitters avoid recurring problems?</w:t>
+        <w:t xml:space="preserve">Would a short public note help submitters address recognition at small sizes, black-and-white legibility, and</w:t>
+      </w:r>
+      <w:r>
+        <w:t xml:space="preserve"> </w:t>
+      </w:r>
+      <w:r>
+        <w:t xml:space="preserve">category-completion arguments?</w:t>
       </w:r>
     </w:p>
     <w:p>
@@ -209,13 +209,7 @@
         </w:numPr>
       </w:pPr>
       <w:r>
-        <w:t xml:space="preserve">If the current guidance already answers these questions, can ESR identify the material that submitters</w:t>
-      </w:r>
-      <w:r>
-        <w:t xml:space="preserve"> </w:t>
-      </w:r>
-      <w:r>
-        <w:t xml:space="preserve">should follow?</w:t>
+        <w:t xml:space="preserve">If these issues are already covered, which guidance should submitters follow?</w:t>
       </w:r>
     </w:p>
     <w:bookmarkEnd w:id="10"/>
@@ -233,13 +227,13 @@
         <w:pStyle w:val="FirstParagraph"/>
       </w:pPr>
       <w:r>
-        <w:t xml:space="preserve">The current Unicode Emoji Ordering places Syringe, Pill, Drop of Blood, Adhesive Bandage, Stethoscope, X-Ray,</w:t>
-      </w:r>
-      <w:r>
-        <w:t xml:space="preserve"> </w:t>
-      </w:r>
-      <w:r>
-        <w:t xml:space="preserve">and Crutch in</w:t>
+        <w:t xml:space="preserve">Health-related emoji are distributed across several sections of the current Unicode Emoji Ordering. Syringe,</w:t>
+      </w:r>
+      <w:r>
+        <w:t xml:space="preserve"> </w:t>
+      </w:r>
+      <w:r>
+        <w:t xml:space="preserve">Pill, Drop of Blood, Adhesive Bandage, Stethoscope, X-Ray, and Crutch are listed under</w:t>
       </w:r>
       <w:r>
         <w:t xml:space="preserve"> </w:t>
@@ -251,7 +245,13 @@
         <w:t xml:space="preserve">Objects &gt; medical</w:t>
       </w:r>
       <w:r>
-        <w:t xml:space="preserve">. Anatomical Heart, Lungs, and Brain are in</w:t>
+        <w:t xml:space="preserve">;</w:t>
+      </w:r>
+      <w:r>
+        <w:t xml:space="preserve"> </w:t>
+      </w:r>
+      <w:r>
+        <w:t xml:space="preserve">Anatomical Heart, Lungs, and Brain under</w:t>
       </w:r>
       <w:r>
         <w:t xml:space="preserve"> </w:t>
@@ -263,7 +263,7 @@
         <w:t xml:space="preserve">People &amp; Body &gt; body-parts</w:t>
       </w:r>
       <w:r>
-        <w:t xml:space="preserve">; Test Tube, Petri Dish, and DNA are in</w:t>
+        <w:t xml:space="preserve">; Test Tube, Petri Dish, and DNA under</w:t>
       </w:r>
       <w:r>
         <w:t xml:space="preserve"> </w:t>
@@ -275,13 +275,7 @@
         <w:t xml:space="preserve">Objects &gt; science</w:t>
       </w:r>
       <w:r>
-        <w:t xml:space="preserve">; Hospital and Ambulance</w:t>
-      </w:r>
-      <w:r>
-        <w:t xml:space="preserve"> </w:t>
-      </w:r>
-      <w:r>
-        <w:t xml:space="preserve">are in</w:t>
+        <w:t xml:space="preserve">; Hospital and Ambulance under</w:t>
       </w:r>
       <w:r>
         <w:t xml:space="preserve"> </w:t>
@@ -293,7 +287,13 @@
         <w:t xml:space="preserve">Travel &amp; Places</w:t>
       </w:r>
       <w:r>
-        <w:t xml:space="preserve">; and Medical Symbol and Wheelchair Symbol are in</w:t>
+        <w:t xml:space="preserve">; and Medical Symbol and Wheelchair Symbol</w:t>
+      </w:r>
+      <w:r>
+        <w:t xml:space="preserve"> </w:t>
+      </w:r>
+      <w:r>
+        <w:t xml:space="preserve">under</w:t>
       </w:r>
       <w:r>
         <w:t xml:space="preserve"> </w:t>
@@ -305,19 +305,13 @@
         <w:t xml:space="preserve">Symbols</w:t>
       </w:r>
       <w:r>
-        <w:t xml:space="preserve">. This document does not</w:t>
-      </w:r>
-      <w:r>
-        <w:t xml:space="preserve"> </w:t>
-      </w:r>
-      <w:r>
-        <w:t xml:space="preserve">propose moving those emoji. Their distribution is one reason a focused review of discoverability, existing</w:t>
-      </w:r>
-      <w:r>
-        <w:t xml:space="preserve"> </w:t>
-      </w:r>
-      <w:r>
-        <w:t xml:space="preserve">substitutes, and closely related proposals may be useful.</w:t>
+        <w:t xml:space="preserve">. We are not proposing to move any of them. The requested review would consider what this</w:t>
+      </w:r>
+      <w:r>
+        <w:t xml:space="preserve"> </w:t>
+      </w:r>
+      <w:r>
+        <w:t xml:space="preserve">distribution means for discoverability, existing substitutes, and the treatment of closely related proposals.</w:t>
       </w:r>
     </w:p>
     <w:p>
@@ -325,13 +319,19 @@
         <w:pStyle w:val="BodyText"/>
       </w:pPr>
       <w:r>
-        <w:t xml:space="preserve">An individual proposal must still show that its concept is independently useful, that an existing emoji cannot</w:t>
-      </w:r>
-      <w:r>
-        <w:t xml:space="preserve"> </w:t>
-      </w:r>
-      <w:r>
-        <w:t xml:space="preserve">express it adequately, and that the image remains clear at emoji size.</w:t>
+        <w:t xml:space="preserve">Every proposal must address Unicode’s published inclusion and exclusion factors, including distinctiveness,</w:t>
+      </w:r>
+      <w:r>
+        <w:t xml:space="preserve"> </w:t>
+      </w:r>
+      <w:r>
+        <w:t xml:space="preserve">expected usage, and whether an existing emoji or sequence already represents the concept. The proposed image</w:t>
+      </w:r>
+      <w:r>
+        <w:t xml:space="preserve"> </w:t>
+      </w:r>
+      <w:r>
+        <w:t xml:space="preserve">must also remain recognizable at emoji size.</w:t>
       </w:r>
     </w:p>
     <w:p>
@@ -339,25 +339,25 @@
         <w:pStyle w:val="BodyText"/>
       </w:pPr>
       <w:r>
-        <w:t xml:space="preserve">The 2026 intake also makes the procedural distinction important. Individual emoji proposals must be submitted</w:t>
-      </w:r>
-      <w:r>
-        <w:t xml:space="preserve"> </w:t>
-      </w:r>
-      <w:r>
-        <w:t xml:space="preserve">through the Emoji Submission Form. A UTC discussion document follows Unicode’s separate document-submission</w:t>
-      </w:r>
-      <w:r>
-        <w:t xml:space="preserve"> </w:t>
-      </w:r>
-      <w:r>
-        <w:t xml:space="preserve">process and may be placed on a UTC agenda or referred to a working group. The two routes serve different</w:t>
-      </w:r>
-      <w:r>
-        <w:t xml:space="preserve"> </w:t>
-      </w:r>
-      <w:r>
-        <w:t xml:space="preserve">purposes.</w:t>
+        <w:t xml:space="preserve">The 2026 process separates individual emoji proposals from UTC discussion documents. New emoji proposals must</w:t>
+      </w:r>
+      <w:r>
+        <w:t xml:space="preserve"> </w:t>
+      </w:r>
+      <w:r>
+        <w:t xml:space="preserve">be filed through the Emoji Submission Form. A discussion document follows Unicode’s separate document</w:t>
+      </w:r>
+      <w:r>
+        <w:t xml:space="preserve"> </w:t>
+      </w:r>
+      <w:r>
+        <w:t xml:space="preserve">submission process and may be placed on a UTC agenda or referred to a working group. This document follows the</w:t>
+      </w:r>
+      <w:r>
+        <w:t xml:space="preserve"> </w:t>
+      </w:r>
+      <w:r>
+        <w:t xml:space="preserve">UTC document submission process.</w:t>
       </w:r>
     </w:p>
     <w:bookmarkEnd w:id="11"/>
@@ -384,25 +384,25 @@
         <w:pStyle w:val="FirstParagraph"/>
       </w:pPr>
       <w:r>
-        <w:t xml:space="preserve">Apple’s L2/18-080 proposed nine accessibility emoji organized around four areas: Blind and Low Vision, Deaf</w:t>
-      </w:r>
-      <w:r>
-        <w:t xml:space="preserve"> </w:t>
-      </w:r>
-      <w:r>
-        <w:t xml:space="preserve">and Hard of Hearing, Physical Motor, and Hidden Disabilities. Apple described the set as a finite starting</w:t>
-      </w:r>
-      <w:r>
-        <w:t xml:space="preserve"> </w:t>
-      </w:r>
-      <w:r>
-        <w:t xml:space="preserve">point rather than a comprehensive catalogue, worked with disability organizations, and addressed Unicode’s</w:t>
-      </w:r>
-      <w:r>
-        <w:t xml:space="preserve"> </w:t>
-      </w:r>
-      <w:r>
-        <w:t xml:space="preserve">open-ended exclusion factor directly.</w:t>
+        <w:t xml:space="preserve">Apple’s L2/18-080 proposed nine accessibility emoji in four areas: Blind and Low Vision, Deaf and Hard of</w:t>
+      </w:r>
+      <w:r>
+        <w:t xml:space="preserve"> </w:t>
+      </w:r>
+      <w:r>
+        <w:t xml:space="preserve">Hearing, Physical Motor, and Hidden Disabilities. Apple presented the set as a finite starting point rather</w:t>
+      </w:r>
+      <w:r>
+        <w:t xml:space="preserve"> </w:t>
+      </w:r>
+      <w:r>
+        <w:t xml:space="preserve">than a comprehensive catalogue. Apple worked with disability organizations and addressed Unicode’s open-ended</w:t>
+      </w:r>
+      <w:r>
+        <w:t xml:space="preserve"> </w:t>
+      </w:r>
+      <w:r>
+        <w:t xml:space="preserve">exclusion factor directly.</w:t>
       </w:r>
     </w:p>
     <w:p>
@@ -410,19 +410,13 @@
         <w:pStyle w:val="BodyText"/>
       </w:pPr>
       <w:r>
-        <w:t xml:space="preserve">The Apple document is a public example of a vendor explaining how several related concepts fit together. It</w:t>
-      </w:r>
-      <w:r>
-        <w:t xml:space="preserve"> </w:t>
-      </w:r>
-      <w:r>
-        <w:t xml:space="preserve">used the emoji-proposal process available in 2018. Under the 2026 guidance, each encoding proposal must use the</w:t>
-      </w:r>
-      <w:r>
-        <w:t xml:space="preserve"> </w:t>
-      </w:r>
-      <w:r>
-        <w:t xml:space="preserve">official form and is evaluated on its own evidence.</w:t>
+        <w:t xml:space="preserve">Apple submitted the nine related concepts together under the emoji-proposal process in effect in 2018. Under</w:t>
+      </w:r>
+      <w:r>
+        <w:t xml:space="preserve"> </w:t>
+      </w:r>
+      <w:r>
+        <w:t xml:space="preserve">the 2026 guidance, each candidate must be submitted through the official form and evaluated on its own evidence.</w:t>
       </w:r>
     </w:p>
     <w:p>
@@ -465,13 +459,7 @@
         <w:t xml:space="preserve"> </w:t>
       </w:r>
       <w:r>
-        <w:t xml:space="preserve">and Lungs. Unicode later encoded both characters. Their history shows that related health concepts can be</w:t>
-      </w:r>
-      <w:r>
-        <w:t xml:space="preserve"> </w:t>
-      </w:r>
-      <w:r>
-        <w:t xml:space="preserve">considered together while each proposal makes its own case.</w:t>
+        <w:t xml:space="preserve">and Lungs. Unicode later encoded both characters. The proposals were related, but each made its own case.</w:t>
       </w:r>
     </w:p>
     <w:p>
@@ -532,7 +520,7 @@
         <w:pStyle w:val="FirstParagraph"/>
       </w:pPr>
       <w:r>
-        <w:t xml:space="preserve">The review could use six working areas. These are not proposed keyboard categories.</w:t>
+        <w:t xml:space="preserve">We suggest six topics for the review. They are not proposed keyboard categories.</w:t>
       </w:r>
     </w:p>
     <w:p>
@@ -544,17 +532,7 @@
         </w:numPr>
       </w:pPr>
       <w:r>
-        <w:rPr>
-          <w:b/>
-          <w:bCs/>
-        </w:rPr>
-        <w:t xml:space="preserve">Anatomy:</w:t>
-      </w:r>
-      <w:r>
-        <w:t xml:space="preserve"> </w:t>
-      </w:r>
-      <w:r>
-        <w:t xml:space="preserve">how proposed internal organs should address category completion and open-endedness.</w:t>
+        <w:t xml:space="preserve">Anatomy: How should internal-organ proposals address category completion and open-endedness?</w:t>
       </w:r>
     </w:p>
     <w:p>
@@ -566,23 +544,13 @@
         </w:numPr>
       </w:pPr>
       <w:r>
-        <w:rPr>
-          <w:b/>
-          <w:bCs/>
-        </w:rPr>
-        <w:t xml:space="preserve">Diagnostics:</w:t>
-      </w:r>
-      <w:r>
-        <w:t xml:space="preserve"> </w:t>
-      </w:r>
-      <w:r>
-        <w:t xml:space="preserve">when CT Scan, Ultrasound, or another modality adds a recognizable procedure or object beyond</w:t>
-      </w:r>
-      <w:r>
-        <w:t xml:space="preserve"> </w:t>
-      </w:r>
-      <w:r>
-        <w:t xml:space="preserve">X-Ray and Stethoscope.</w:t>
+        <w:t xml:space="preserve">Diagnostics: When would CT Scan, Ultrasound, or another modality represent a procedure or object that X-Ray</w:t>
+      </w:r>
+      <w:r>
+        <w:t xml:space="preserve"> </w:t>
+      </w:r>
+      <w:r>
+        <w:t xml:space="preserve">and Stethoscope do not adequately convey?</w:t>
       </w:r>
     </w:p>
     <w:p>
@@ -594,17 +562,13 @@
         </w:numPr>
       </w:pPr>
       <w:r>
-        <w:rPr>
-          <w:b/>
-          <w:bCs/>
-        </w:rPr>
-        <w:t xml:space="preserve">Laboratory science:</w:t>
-      </w:r>
-      <w:r>
-        <w:t xml:space="preserve"> </w:t>
-      </w:r>
-      <w:r>
-        <w:t xml:space="preserve">visual overlap among cells, microbes, specimens, and laboratory equipment.</w:t>
+        <w:t xml:space="preserve">Laboratory science: How should proposals address visual overlap among cells, microbes, specimens, and</w:t>
+      </w:r>
+      <w:r>
+        <w:t xml:space="preserve"> </w:t>
+      </w:r>
+      <w:r>
+        <w:t xml:space="preserve">equipment?</w:t>
       </w:r>
     </w:p>
     <w:p>
@@ -616,23 +580,13 @@
         </w:numPr>
       </w:pPr>
       <w:r>
-        <w:rPr>
-          <w:b/>
-          <w:bCs/>
-        </w:rPr>
-        <w:t xml:space="preserve">Medication:</w:t>
-      </w:r>
-      <w:r>
-        <w:t xml:space="preserve"> </w:t>
-      </w:r>
-      <w:r>
-        <w:t xml:space="preserve">how organizers, packaging, delivery devices, and adherence concepts should address the</w:t>
-      </w:r>
-      <w:r>
-        <w:t xml:space="preserve"> </w:t>
-      </w:r>
-      <w:r>
-        <w:t xml:space="preserve">existing Pill and Syringe emoji.</w:t>
+        <w:t xml:space="preserve">Medication: How should proposals for organizers, packaging, delivery devices, or adherence concepts establish</w:t>
+      </w:r>
+      <w:r>
+        <w:t xml:space="preserve"> </w:t>
+      </w:r>
+      <w:r>
+        <w:t xml:space="preserve">that they are distinct from Pill and Syringe?</w:t>
       </w:r>
     </w:p>
     <w:p>
@@ -644,23 +598,13 @@
         </w:numPr>
       </w:pPr>
       <w:r>
-        <w:rPr>
-          <w:b/>
-          <w:bCs/>
-        </w:rPr>
-        <w:t xml:space="preserve">Emergency care:</w:t>
-      </w:r>
-      <w:r>
-        <w:t xml:space="preserve"> </w:t>
-      </w:r>
-      <w:r>
-        <w:t xml:space="preserve">when an additional object has a broad communication function beyond Adhesive Bandage,</w:t>
-      </w:r>
-      <w:r>
-        <w:t xml:space="preserve"> </w:t>
-      </w:r>
-      <w:r>
-        <w:t xml:space="preserve">Crutch, Ambulance, and Hospital.</w:t>
+        <w:t xml:space="preserve">Emergency care: When would an additional object support a broad communication need not met by Adhesive</w:t>
+      </w:r>
+      <w:r>
+        <w:t xml:space="preserve"> </w:t>
+      </w:r>
+      <w:r>
+        <w:t xml:space="preserve">Bandage, Crutch, Ambulance, or Hospital?</w:t>
       </w:r>
     </w:p>
     <w:p>
@@ -672,23 +616,13 @@
         </w:numPr>
       </w:pPr>
       <w:r>
-        <w:rPr>
-          <w:b/>
-          <w:bCs/>
-        </w:rPr>
-        <w:t xml:space="preserve">Clinical equipment:</w:t>
-      </w:r>
-      <w:r>
-        <w:t xml:space="preserve"> </w:t>
-      </w:r>
-      <w:r>
-        <w:t xml:space="preserve">recognition at small sizes, color independence, and overlap among equipment</w:t>
-      </w:r>
-      <w:r>
-        <w:t xml:space="preserve"> </w:t>
-      </w:r>
-      <w:r>
-        <w:t xml:space="preserve">silhouettes.</w:t>
+        <w:t xml:space="preserve">Clinical equipment: Which designs remain recognizable at small sizes, work without color, and avoid overlap</w:t>
+      </w:r>
+      <w:r>
+        <w:t xml:space="preserve"> </w:t>
+      </w:r>
+      <w:r>
+        <w:t xml:space="preserve">with other equipment silhouettes?</w:t>
       </w:r>
     </w:p>
     <w:p>
@@ -696,13 +630,7 @@
         <w:pStyle w:val="FirstParagraph"/>
       </w:pPr>
       <w:r>
-        <w:t xml:space="preserve">These areas would organize the review. They do not imply that every gap should produce a character or that</w:t>
-      </w:r>
-      <w:r>
-        <w:t xml:space="preserve"> </w:t>
-      </w:r>
-      <w:r>
-        <w:t xml:space="preserve">Unicode should create a top-level Health group.</w:t>
+        <w:t xml:space="preserve">A gap alone would not warrant a character, and this document does not propose a top-level Health group.</w:t>
       </w:r>
     </w:p>
     <w:bookmarkEnd w:id="18"/>
@@ -720,19 +648,19 @@
         <w:pStyle w:val="FirstParagraph"/>
       </w:pPr>
       <w:r>
-        <w:t xml:space="preserve">Each proposed emoji must stand on its own. A complete submission includes the required color and</w:t>
-      </w:r>
-      <w:r>
-        <w:t xml:space="preserve"> </w:t>
-      </w:r>
-      <w:r>
-        <w:t xml:space="preserve">black-and-white images, keywords, category and sort location, expected-usage evidence, inclusion and exclusion</w:t>
-      </w:r>
-      <w:r>
-        <w:t xml:space="preserve"> </w:t>
-      </w:r>
-      <w:r>
-        <w:t xml:space="preserve">factors, image-rights warranty, and relevant proposal history.</w:t>
+        <w:t xml:space="preserve">Each candidate needs its own complete submission under the current form and guidelines. Required elements</w:t>
+      </w:r>
+      <w:r>
+        <w:t xml:space="preserve"> </w:t>
+      </w:r>
+      <w:r>
+        <w:t xml:space="preserve">include color and black-and-white images, keywords, category, frequency evidence, all selection factors, an</w:t>
+      </w:r>
+      <w:r>
+        <w:t xml:space="preserve"> </w:t>
+      </w:r>
+      <w:r>
+        <w:t xml:space="preserve">image-rights warranty, and the required license.</w:t>
       </w:r>
     </w:p>
     <w:p>
@@ -740,7 +668,7 @@
         <w:pStyle w:val="BodyText"/>
       </w:pPr>
       <w:r>
-        <w:t xml:space="preserve">This document takes no position on any candidate. Each candidate requires a separate submission and decision.</w:t>
+        <w:t xml:space="preserve">This document does not endorse or oppose any candidate. Each candidate requires a separate decision.</w:t>
       </w:r>
     </w:p>
     <w:bookmarkEnd w:id="19"/>
@@ -758,13 +686,13 @@
         <w:pStyle w:val="FirstParagraph"/>
       </w:pPr>
       <w:r>
-        <w:t xml:space="preserve">Vendor reviewers can provide useful technical observations without committing to implement a candidate. Their</w:t>
-      </w:r>
-      <w:r>
-        <w:t xml:space="preserve"> </w:t>
-      </w:r>
-      <w:r>
-        <w:t xml:space="preserve">input may address:</w:t>
+        <w:t xml:space="preserve">Vendors can comment on design and implementation without committing to include a candidate in their products.</w:t>
+      </w:r>
+      <w:r>
+        <w:t xml:space="preserve"> </w:t>
+      </w:r>
+      <w:r>
+        <w:t xml:space="preserve">Relevant questions include:</w:t>
       </w:r>
     </w:p>
     <w:p>
@@ -776,7 +704,7 @@
         </w:numPr>
       </w:pPr>
       <w:r>
-        <w:t xml:space="preserve">whether an unfamiliar viewer can identify the image at common emoji sizes;</w:t>
+        <w:t xml:space="preserve">Can someone unfamiliar with the concept identify it at common emoji sizes?</w:t>
       </w:r>
     </w:p>
     <w:p>
@@ -788,7 +716,7 @@
         </w:numPr>
       </w:pPr>
       <w:r>
-        <w:t xml:space="preserve">whether the meaning survives in black and white;</w:t>
+        <w:t xml:space="preserve">Does the image retain its meaning in black and white?</w:t>
       </w:r>
     </w:p>
     <w:p>
@@ -800,7 +728,7 @@
         </w:numPr>
       </w:pPr>
       <w:r>
-        <w:t xml:space="preserve">whether the design is platform-neutral and free of text or protected symbols;</w:t>
+        <w:t xml:space="preserve">Is the design platform-neutral and free of text, logos, brands, or other third-party intellectual property?</w:t>
       </w:r>
     </w:p>
     <w:p>
@@ -812,7 +740,7 @@
         </w:numPr>
       </w:pPr>
       <w:r>
-        <w:t xml:space="preserve">whether two related concepts would be distinguishable in the same emoji set; and</w:t>
+        <w:t xml:space="preserve">Would two related concepts remain distinguishable in the same emoji set?</w:t>
       </w:r>
     </w:p>
     <w:p>
@@ -824,7 +752,7 @@
         </w:numPr>
       </w:pPr>
       <w:r>
-        <w:t xml:space="preserve">whether implementation or interoperability concerns should be shared with ESR.</w:t>
+        <w:t xml:space="preserve">Are there implementation or interoperability concerns that ESR should consider?</w:t>
       </w:r>
     </w:p>
     <w:p>
@@ -832,7 +760,7 @@
         <w:pStyle w:val="FirstParagraph"/>
       </w:pPr>
       <w:r>
-        <w:t xml:space="preserve">Submitters remain responsible for evidence, licensing, and proposal completeness.</w:t>
+        <w:t xml:space="preserve">Submitters remain responsible for their evidence, licensing, and the completeness of their proposals.</w:t>
       </w:r>
     </w:p>
     <w:bookmarkEnd w:id="20"/>
@@ -850,19 +778,13 @@
         <w:pStyle w:val="FirstParagraph"/>
       </w:pPr>
       <w:r>
-        <w:t xml:space="preserve">We ask the UTC to refer this document to ESR for review and recommendation. ESR could advise whether the</w:t>
-      </w:r>
-      <w:r>
-        <w:t xml:space="preserve"> </w:t>
-      </w:r>
-      <w:r>
-        <w:t xml:space="preserve">current guidance is sufficient, whether a short public note or focused review would help, or whether no</w:t>
-      </w:r>
-      <w:r>
-        <w:t xml:space="preserve"> </w:t>
-      </w:r>
-      <w:r>
-        <w:t xml:space="preserve">further action is needed.</w:t>
+        <w:t xml:space="preserve">We ask the UTC to refer this document to ESR for review and recommendation. ESR could advise that the current</w:t>
+      </w:r>
+      <w:r>
+        <w:t xml:space="preserve"> </w:t>
+      </w:r>
+      <w:r>
+        <w:t xml:space="preserve">guidance is sufficient and no further action is needed, or recommend a short public note or focused review.</w:t>
       </w:r>
     </w:p>
     <w:p>
@@ -870,13 +792,19 @@
         <w:pStyle w:val="BodyText"/>
       </w:pPr>
       <w:r>
-        <w:t xml:space="preserve">This document requests no character encoding and no bundled approval. Every candidate remains subject to the</w:t>
-      </w:r>
-      <w:r>
-        <w:t xml:space="preserve"> </w:t>
-      </w:r>
-      <w:r>
-        <w:t xml:space="preserve">official Emoji Submission Form and an independent review under Unicode’s published criteria.</w:t>
+        <w:t xml:space="preserve">We are asking only for referral, not character encoding or bundled approval. Every candidate must still be</w:t>
+      </w:r>
+      <w:r>
+        <w:t xml:space="preserve"> </w:t>
+      </w:r>
+      <w:r>
+        <w:t xml:space="preserve">submitted through the official Emoji Submission Form and reviewed independently under Unicode’s published</w:t>
+      </w:r>
+      <w:r>
+        <w:t xml:space="preserve"> </w:t>
+      </w:r>
+      <w:r>
+        <w:t xml:space="preserve">criteria.</w:t>
       </w:r>
     </w:p>
     <w:bookmarkEnd w:id="21"/>

</xml_diff>

<commit_message>
docs: strengthen L2 why-now rationale
</commit_message>
<xml_diff>
--- a/docs/proposals/utc-health-category/health-related-emoji-coverage-l2-submission.docx
+++ b/docs/proposals/utc-health-category/health-related-emoji-coverage-l2-submission.docx
@@ -213,13 +213,13 @@
       </w:r>
     </w:p>
     <w:bookmarkEnd w:id="10"/>
-    <w:bookmarkStart w:id="11" w:name="why-this-question-has-arisen"/>
+    <w:bookmarkStart w:id="11" w:name="why-now"/>
     <w:p>
       <w:pPr>
         <w:pStyle w:val="Heading1"/>
       </w:pPr>
       <w:r>
-        <w:t xml:space="preserve">Why this question has arisen</w:t>
+        <w:t xml:space="preserve">Why now</w:t>
       </w:r>
     </w:p>
     <w:p>
@@ -312,6 +312,82 @@
       </w:r>
       <w:r>
         <w:t xml:space="preserve">distribution means for discoverability, existing substitutes, and the treatment of closely related proposals.</w:t>
+      </w:r>
+    </w:p>
+    <w:p>
+      <w:pPr>
+        <w:pStyle w:val="BodyText"/>
+      </w:pPr>
+      <w:r>
+        <w:t xml:space="preserve">These examples are the existing baseline for this review: health-related emoji already include medical</w:t>
+      </w:r>
+      <w:r>
+        <w:t xml:space="preserve"> </w:t>
+      </w:r>
+      <w:r>
+        <w:t xml:space="preserve">objects, anatomy, laboratory science, care settings, emergency transport, accessibility symbols, and health</w:t>
+      </w:r>
+      <w:r>
+        <w:t xml:space="preserve"> </w:t>
+      </w:r>
+      <w:r>
+        <w:t xml:space="preserve">symbols. The question is whether that baseline is clear enough for users and for submitters proposing nearby</w:t>
+      </w:r>
+      <w:r>
+        <w:t xml:space="preserve"> </w:t>
+      </w:r>
+      <w:r>
+        <w:t xml:space="preserve">concepts.</w:t>
+      </w:r>
+    </w:p>
+    <w:p>
+      <w:pPr>
+        <w:pStyle w:val="BodyText"/>
+      </w:pPr>
+      <w:r>
+        <w:t xml:space="preserve">The question is also timely because health communication has moved further into everyday digital channels.</w:t>
+      </w:r>
+      <w:r>
+        <w:t xml:space="preserve"> </w:t>
+      </w:r>
+      <w:r>
+        <w:t xml:space="preserve">Pew Research Center reported in 2026 that 52% of U.S. adults under 30 get health information from social</w:t>
+      </w:r>
+      <w:r>
+        <w:t xml:space="preserve"> </w:t>
+      </w:r>
+      <w:r>
+        <w:t xml:space="preserve">media at least sometimes, and McKinsey’s 2025 Future of Wellness survey reported that nearly 30% of U.S. Gen</w:t>
+      </w:r>
+      <w:r>
+        <w:t xml:space="preserve"> </w:t>
+      </w:r>
+      <w:r>
+        <w:t xml:space="preserve">Z and millennial respondents were prioritizing wellness</w:t>
+      </w:r>
+      <w:r>
+        <w:t xml:space="preserve"> </w:t>
+      </w:r>
+      <w:r>
+        <w:t xml:space="preserve">“a lot more”</w:t>
+      </w:r>
+      <w:r>
+        <w:t xml:space="preserve"> </w:t>
+      </w:r>
+      <w:r>
+        <w:t xml:space="preserve">than one year earlier. These trends do</w:t>
+      </w:r>
+      <w:r>
+        <w:t xml:space="preserve"> </w:t>
+      </w:r>
+      <w:r>
+        <w:t xml:space="preserve">not support any particular emoji on their own. They do show why users may increasingly expect common health</w:t>
+      </w:r>
+      <w:r>
+        <w:t xml:space="preserve"> </w:t>
+      </w:r>
+      <w:r>
+        <w:t xml:space="preserve">concepts to be represented in the same interoperable visual vocabulary used for daily communication.</w:t>
       </w:r>
     </w:p>
     <w:p>
@@ -808,7 +884,7 @@
       </w:r>
     </w:p>
     <w:bookmarkEnd w:id="21"/>
-    <w:bookmarkStart w:id="29" w:name="references"/>
+    <w:bookmarkStart w:id="27" w:name="references"/>
     <w:p>
       <w:pPr>
         <w:pStyle w:val="Heading1"/>
@@ -872,7 +948,7 @@
         </w:numPr>
       </w:pPr>
       <w:r>
-        <w:t xml:space="preserve">Unicode, Emoji Submission FAQ:</w:t>
+        <w:t xml:space="preserve">Unicode, Emoji Ordering:</w:t>
       </w:r>
       <w:r>
         <w:br/>
@@ -882,99 +958,7 @@
           <w:rPr>
             <w:rStyle w:val="Hyperlink"/>
           </w:rPr>
-          <w:t xml:space="preserve">https://www.unicode.org/faq/emoji_submission.html</w:t>
-        </w:r>
-      </w:hyperlink>
-    </w:p>
-    <w:p>
-      <w:pPr>
-        <w:pStyle w:val="Compact"/>
-        <w:numPr>
-          <w:ilvl w:val="0"/>
-          <w:numId w:val="1005"/>
-        </w:numPr>
-      </w:pPr>
-      <w:r>
-        <w:t xml:space="preserve">Unicode, Emoji Standard &amp; Research Working Group Report for UTC #186:</w:t>
-      </w:r>
-      <w:r>
-        <w:br/>
-      </w:r>
-      <w:hyperlink r:id="rId25">
-        <w:r>
-          <w:rPr>
-            <w:rStyle w:val="Hyperlink"/>
-          </w:rPr>
-          <w:t xml:space="preserve">https://www.unicode.org/L2/L2026/26008r-esr-report-utc186.pdf</w:t>
-        </w:r>
-      </w:hyperlink>
-    </w:p>
-    <w:p>
-      <w:pPr>
-        <w:pStyle w:val="Compact"/>
-        <w:numPr>
-          <w:ilvl w:val="0"/>
-          <w:numId w:val="1005"/>
-        </w:numPr>
-      </w:pPr>
-      <w:r>
-        <w:t xml:space="preserve">Unicode, Emoji Ordering:</w:t>
-      </w:r>
-      <w:r>
-        <w:br/>
-      </w:r>
-      <w:hyperlink r:id="rId26">
-        <w:r>
-          <w:rPr>
-            <w:rStyle w:val="Hyperlink"/>
-          </w:rPr>
           <w:t xml:space="preserve">https://unicode.org/emoji/charts/emoji-ordering.html</w:t>
-        </w:r>
-      </w:hyperlink>
-    </w:p>
-    <w:p>
-      <w:pPr>
-        <w:pStyle w:val="Compact"/>
-        <w:numPr>
-          <w:ilvl w:val="0"/>
-          <w:numId w:val="1005"/>
-        </w:numPr>
-      </w:pPr>
-      <w:r>
-        <w:t xml:space="preserve">Unicode, Unicode Emoji List:</w:t>
-      </w:r>
-      <w:r>
-        <w:br/>
-      </w:r>
-      <w:hyperlink r:id="rId27">
-        <w:r>
-          <w:rPr>
-            <w:rStyle w:val="Hyperlink"/>
-          </w:rPr>
-          <w:t xml:space="preserve">https://unicode.org/emoji/charts/emoji-list.html</w:t>
-        </w:r>
-      </w:hyperlink>
-    </w:p>
-    <w:p>
-      <w:pPr>
-        <w:pStyle w:val="Compact"/>
-        <w:numPr>
-          <w:ilvl w:val="0"/>
-          <w:numId w:val="1005"/>
-        </w:numPr>
-      </w:pPr>
-      <w:r>
-        <w:t xml:space="preserve">Unicode, Unicode Standard Annex #51:</w:t>
-      </w:r>
-      <w:r>
-        <w:br/>
-      </w:r>
-      <w:hyperlink r:id="rId28">
-        <w:r>
-          <w:rPr>
-            <w:rStyle w:val="Hyperlink"/>
-          </w:rPr>
-          <w:t xml:space="preserve">https://www.unicode.org/reports/tr51/</w:t>
         </w:r>
       </w:hyperlink>
     </w:p>
@@ -1001,7 +985,77 @@
         </w:r>
       </w:hyperlink>
     </w:p>
-    <w:bookmarkEnd w:id="29"/>
+    <w:p>
+      <w:pPr>
+        <w:pStyle w:val="Compact"/>
+        <w:numPr>
+          <w:ilvl w:val="0"/>
+          <w:numId w:val="1005"/>
+        </w:numPr>
+      </w:pPr>
+      <w:r>
+        <w:t xml:space="preserve">Pew Research Center,</w:t>
+      </w:r>
+      <w:r>
+        <w:t xml:space="preserve"> </w:t>
+      </w:r>
+      <w:r>
+        <w:t xml:space="preserve">“Users of social media and AI chatbots for health information are more likely to say</w:t>
+      </w:r>
+      <w:r>
+        <w:t xml:space="preserve"> </w:t>
+      </w:r>
+      <w:r>
+        <w:t xml:space="preserve">they are convenient than accurate”</w:t>
+      </w:r>
+      <w:r>
+        <w:t xml:space="preserve">:</w:t>
+      </w:r>
+      <w:r>
+        <w:br/>
+      </w:r>
+      <w:hyperlink r:id="rId25">
+        <w:r>
+          <w:rPr>
+            <w:rStyle w:val="Hyperlink"/>
+          </w:rPr>
+          <w:t xml:space="preserve">https://www.pewresearch.org/science/2026/04/07/users-of-social-media-and-ai-chatbots-for-health-information-are-more-likely-to-say-they-are-convenient-than-accurate/</w:t>
+        </w:r>
+      </w:hyperlink>
+    </w:p>
+    <w:p>
+      <w:pPr>
+        <w:pStyle w:val="Compact"/>
+        <w:numPr>
+          <w:ilvl w:val="0"/>
+          <w:numId w:val="1005"/>
+        </w:numPr>
+      </w:pPr>
+      <w:r>
+        <w:t xml:space="preserve">McKinsey &amp; Company,</w:t>
+      </w:r>
+      <w:r>
+        <w:t xml:space="preserve"> </w:t>
+      </w:r>
+      <w:r>
+        <w:t xml:space="preserve">“The Future of Wellness trends survey 2025”</w:t>
+      </w:r>
+      <w:r>
+        <w:t xml:space="preserve">:</w:t>
+      </w:r>
+      <w:r>
+        <w:br/>
+      </w:r>
+      <w:hyperlink r:id="rId26">
+        <w:r>
+          <w:rPr>
+            <w:rStyle w:val="Hyperlink"/>
+          </w:rPr>
+          <w:t xml:space="preserve">https://www.mckinsey.com/industries/consumer-packaged-goods/our-insights/future-of-wellness-trends</w:t>
+        </w:r>
+      </w:hyperlink>
+    </w:p>
+    <w:bookmarkEnd w:id="27"/>
     <w:sectPr>
       <w:footnotePr>
         <w:numRestart w:val="eachSect"/>

</xml_diff>

<commit_message>
docs: add Copilot health usage evidence to L2 paper
</commit_message>
<xml_diff>
--- a/docs/proposals/utc-health-category/health-related-emoji-coverage-l2-submission.docx
+++ b/docs/proposals/utc-health-category/health-related-emoji-coverage-l2-submission.docx
@@ -227,91 +227,37 @@
         <w:pStyle w:val="FirstParagraph"/>
       </w:pPr>
       <w:r>
-        <w:t xml:space="preserve">Health-related emoji are distributed across several sections of the current Unicode Emoji Ordering. Syringe,</w:t>
-      </w:r>
-      <w:r>
-        <w:t xml:space="preserve"> </w:t>
-      </w:r>
-      <w:r>
-        <w:t xml:space="preserve">Pill, Drop of Blood, Adhesive Bandage, Stethoscope, X-Ray, and Crutch are listed under</w:t>
-      </w:r>
-      <w:r>
-        <w:t xml:space="preserve"> </w:t>
-      </w:r>
-      <w:r>
-        <w:rPr>
-          <w:rStyle w:val="VerbatimChar"/>
-        </w:rPr>
-        <w:t xml:space="preserve">Objects &gt; medical</w:t>
-      </w:r>
-      <w:r>
-        <w:t xml:space="preserve">;</w:t>
-      </w:r>
-      <w:r>
-        <w:t xml:space="preserve"> </w:t>
-      </w:r>
-      <w:r>
-        <w:t xml:space="preserve">Anatomical Heart, Lungs, and Brain under</w:t>
-      </w:r>
-      <w:r>
-        <w:t xml:space="preserve"> </w:t>
-      </w:r>
-      <w:r>
-        <w:rPr>
-          <w:rStyle w:val="VerbatimChar"/>
-        </w:rPr>
-        <w:t xml:space="preserve">People &amp; Body &gt; body-parts</w:t>
-      </w:r>
-      <w:r>
-        <w:t xml:space="preserve">; Test Tube, Petri Dish, and DNA under</w:t>
-      </w:r>
-      <w:r>
-        <w:t xml:space="preserve"> </w:t>
-      </w:r>
-      <w:r>
-        <w:rPr>
-          <w:rStyle w:val="VerbatimChar"/>
-        </w:rPr>
-        <w:t xml:space="preserve">Objects &gt; science</w:t>
-      </w:r>
-      <w:r>
-        <w:t xml:space="preserve">; Hospital and Ambulance under</w:t>
-      </w:r>
-      <w:r>
-        <w:t xml:space="preserve"> </w:t>
-      </w:r>
-      <w:r>
-        <w:rPr>
-          <w:rStyle w:val="VerbatimChar"/>
-        </w:rPr>
-        <w:t xml:space="preserve">Travel &amp; Places</w:t>
-      </w:r>
-      <w:r>
-        <w:t xml:space="preserve">; and Medical Symbol and Wheelchair Symbol</w:t>
-      </w:r>
-      <w:r>
-        <w:t xml:space="preserve"> </w:t>
-      </w:r>
-      <w:r>
-        <w:t xml:space="preserve">under</w:t>
-      </w:r>
-      <w:r>
-        <w:t xml:space="preserve"> </w:t>
-      </w:r>
-      <w:r>
-        <w:rPr>
-          <w:rStyle w:val="VerbatimChar"/>
-        </w:rPr>
-        <w:t xml:space="preserve">Symbols</w:t>
-      </w:r>
-      <w:r>
-        <w:t xml:space="preserve">. We are not proposing to move any of them. The requested review would consider what this</w:t>
-      </w:r>
-      <w:r>
-        <w:t xml:space="preserve"> </w:t>
-      </w:r>
-      <w:r>
-        <w:t xml:space="preserve">distribution means for discoverability, existing substitutes, and the treatment of closely related proposals.</w:t>
+        <w:t xml:space="preserve">Health-related emoji are distributed across the current Unicode Emoji Ordering: medical objects (Syringe,</w:t>
+      </w:r>
+      <w:r>
+        <w:t xml:space="preserve"> </w:t>
+      </w:r>
+      <w:r>
+        <w:t xml:space="preserve">Pill, Drop of Blood, Adhesive Bandage, Stethoscope, X-Ray, Crutch), body parts (Anatomical Heart, Lungs,</w:t>
+      </w:r>
+      <w:r>
+        <w:t xml:space="preserve"> </w:t>
+      </w:r>
+      <w:r>
+        <w:t xml:space="preserve">Brain), science (Test Tube, Petri Dish, DNA), Travel &amp; Places (Hospital, Ambulance), and Symbols (Medical</w:t>
+      </w:r>
+      <w:r>
+        <w:t xml:space="preserve"> </w:t>
+      </w:r>
+      <w:r>
+        <w:t xml:space="preserve">Symbol, Wheelchair Symbol). We are not proposing to move any of them. The requested review would consider</w:t>
+      </w:r>
+      <w:r>
+        <w:t xml:space="preserve"> </w:t>
+      </w:r>
+      <w:r>
+        <w:t xml:space="preserve">what this distribution means for discoverability, existing substitutes, and the treatment of closely related</w:t>
+      </w:r>
+      <w:r>
+        <w:t xml:space="preserve"> </w:t>
+      </w:r>
+      <w:r>
+        <w:t xml:space="preserve">proposals.</w:t>
       </w:r>
     </w:p>
     <w:p>
@@ -319,25 +265,19 @@
         <w:pStyle w:val="BodyText"/>
       </w:pPr>
       <w:r>
-        <w:t xml:space="preserve">These examples are the existing baseline for this review: health-related emoji already include medical</w:t>
-      </w:r>
-      <w:r>
-        <w:t xml:space="preserve"> </w:t>
-      </w:r>
-      <w:r>
-        <w:t xml:space="preserve">objects, anatomy, laboratory science, care settings, emergency transport, accessibility symbols, and health</w:t>
-      </w:r>
-      <w:r>
-        <w:t xml:space="preserve"> </w:t>
-      </w:r>
-      <w:r>
-        <w:t xml:space="preserve">symbols. The question is whether that baseline is clear enough for users and for submitters proposing nearby</w:t>
-      </w:r>
-      <w:r>
-        <w:t xml:space="preserve"> </w:t>
-      </w:r>
-      <w:r>
-        <w:t xml:space="preserve">concepts.</w:t>
+        <w:t xml:space="preserve">These examples are the baseline for this review: health-related emoji already include medical objects,</w:t>
+      </w:r>
+      <w:r>
+        <w:t xml:space="preserve"> </w:t>
+      </w:r>
+      <w:r>
+        <w:t xml:space="preserve">anatomy, laboratory science, care settings, emergency transport, accessibility symbols, and health symbols.</w:t>
+      </w:r>
+      <w:r>
+        <w:t xml:space="preserve"> </w:t>
+      </w:r>
+      <w:r>
+        <w:t xml:space="preserve">The question is whether that baseline is clear enough for users and for submitters proposing nearby concepts.</w:t>
       </w:r>
     </w:p>
     <w:p>
@@ -345,25 +285,25 @@
         <w:pStyle w:val="BodyText"/>
       </w:pPr>
       <w:r>
-        <w:t xml:space="preserve">The question is also timely because health communication has moved further into everyday digital channels.</w:t>
-      </w:r>
-      <w:r>
-        <w:t xml:space="preserve"> </w:t>
-      </w:r>
-      <w:r>
-        <w:t xml:space="preserve">Pew Research Center reported in 2026 that 52% of U.S. adults under 30 get health information from social</w:t>
-      </w:r>
-      <w:r>
-        <w:t xml:space="preserve"> </w:t>
-      </w:r>
-      <w:r>
-        <w:t xml:space="preserve">media at least sometimes, and McKinsey’s 2025 Future of Wellness survey reported that nearly 30% of U.S. Gen</w:t>
-      </w:r>
-      <w:r>
-        <w:t xml:space="preserve"> </w:t>
-      </w:r>
-      <w:r>
-        <w:t xml:space="preserve">Z and millennial respondents were prioritizing wellness</w:t>
+        <w:t xml:space="preserve">Health communication has also moved further into everyday digital channels. Pew Research Center reported in</w:t>
+      </w:r>
+      <w:r>
+        <w:t xml:space="preserve"> </w:t>
+      </w:r>
+      <w:r>
+        <w:t xml:space="preserve">2026 that 52% of U.S. adults under 30 get health information from social media at least sometimes; McKinsey’s</w:t>
+      </w:r>
+      <w:r>
+        <w:t xml:space="preserve"> </w:t>
+      </w:r>
+      <w:r>
+        <w:t xml:space="preserve">2025 Future of Wellness survey reported that nearly 30% of U.S. Gen Z and millennial respondents were</w:t>
+      </w:r>
+      <w:r>
+        <w:t xml:space="preserve"> </w:t>
+      </w:r>
+      <w:r>
+        <w:t xml:space="preserve">prioritizing wellness</w:t>
       </w:r>
       <w:r>
         <w:t xml:space="preserve"> </w:t>
@@ -375,19 +315,37 @@
         <w:t xml:space="preserve"> </w:t>
       </w:r>
       <w:r>
-        <w:t xml:space="preserve">than one year earlier. These trends do</w:t>
-      </w:r>
-      <w:r>
-        <w:t xml:space="preserve"> </w:t>
-      </w:r>
-      <w:r>
-        <w:t xml:space="preserve">not support any particular emoji on their own. They do show why users may increasingly expect common health</w:t>
-      </w:r>
-      <w:r>
-        <w:t xml:space="preserve"> </w:t>
-      </w:r>
-      <w:r>
-        <w:t xml:space="preserve">concepts to be represented in the same interoperable visual vocabulary used for daily communication.</w:t>
+        <w:t xml:space="preserve">than one year earlier; and a 2026 Nature Health study of more than 500,000</w:t>
+      </w:r>
+      <w:r>
+        <w:t xml:space="preserve"> </w:t>
+      </w:r>
+      <w:r>
+        <w:t xml:space="preserve">de-identified Microsoft Copilot health conversations reported that nearly one in five conversations involved</w:t>
+      </w:r>
+      <w:r>
+        <w:t xml:space="preserve"> </w:t>
+      </w:r>
+      <w:r>
+        <w:t xml:space="preserve">personal symptom assessment or condition discussion, and that one in seven personal health queries concerned</w:t>
+      </w:r>
+      <w:r>
+        <w:t xml:space="preserve"> </w:t>
+      </w:r>
+      <w:r>
+        <w:t xml:space="preserve">someone other than the user. These trends do not support any particular emoji. They do show why users may</w:t>
+      </w:r>
+      <w:r>
+        <w:t xml:space="preserve"> </w:t>
+      </w:r>
+      <w:r>
+        <w:t xml:space="preserve">increasingly expect common health concepts to be represented in the same interoperable visual vocabulary used</w:t>
+      </w:r>
+      <w:r>
+        <w:t xml:space="preserve"> </w:t>
+      </w:r>
+      <w:r>
+        <w:t xml:space="preserve">for daily communication.</w:t>
       </w:r>
     </w:p>
     <w:p>
@@ -415,25 +373,19 @@
         <w:pStyle w:val="BodyText"/>
       </w:pPr>
       <w:r>
-        <w:t xml:space="preserve">The 2026 process separates individual emoji proposals from UTC discussion documents. New emoji proposals must</w:t>
-      </w:r>
-      <w:r>
-        <w:t xml:space="preserve"> </w:t>
-      </w:r>
-      <w:r>
-        <w:t xml:space="preserve">be filed through the Emoji Submission Form. A discussion document follows Unicode’s separate document</w:t>
-      </w:r>
-      <w:r>
-        <w:t xml:space="preserve"> </w:t>
-      </w:r>
-      <w:r>
-        <w:t xml:space="preserve">submission process and may be placed on a UTC agenda or referred to a working group. This document follows the</w:t>
-      </w:r>
-      <w:r>
-        <w:t xml:space="preserve"> </w:t>
-      </w:r>
-      <w:r>
-        <w:t xml:space="preserve">UTC document submission process.</w:t>
+        <w:t xml:space="preserve">The 2026 process separates emoji proposals from UTC discussion documents: new emoji go through the Emoji</w:t>
+      </w:r>
+      <w:r>
+        <w:t xml:space="preserve"> </w:t>
+      </w:r>
+      <w:r>
+        <w:t xml:space="preserve">Submission Form; a discussion document follows Unicode’s separate document submission process and may be</w:t>
+      </w:r>
+      <w:r>
+        <w:t xml:space="preserve"> </w:t>
+      </w:r>
+      <w:r>
+        <w:t xml:space="preserve">placed on a UTC agenda or referred to a working group.</w:t>
       </w:r>
     </w:p>
     <w:bookmarkEnd w:id="11"/>
@@ -768,7 +720,81 @@
         <w:t xml:space="preserve"> </w:t>
       </w:r>
       <w:r>
-        <w:t xml:space="preserve">Relevant questions include:</w:t>
+        <w:t xml:space="preserve">Relevant questions include recognizability at common emoji sizes, black-and-white legibility,</w:t>
+      </w:r>
+      <w:r>
+        <w:t xml:space="preserve"> </w:t>
+      </w:r>
+      <w:r>
+        <w:t xml:space="preserve">platform-neutral design without text, logos, brands, or other third-party intellectual property, distinction</w:t>
+      </w:r>
+      <w:r>
+        <w:t xml:space="preserve"> </w:t>
+      </w:r>
+      <w:r>
+        <w:t xml:space="preserve">between related concepts, and implementation or interoperability concerns.</w:t>
+      </w:r>
+    </w:p>
+    <w:p>
+      <w:pPr>
+        <w:pStyle w:val="BodyText"/>
+      </w:pPr>
+      <w:r>
+        <w:t xml:space="preserve">Submitters remain responsible for their evidence, licensing, and the completeness of their proposals.</w:t>
+      </w:r>
+    </w:p>
+    <w:bookmarkEnd w:id="20"/>
+    <w:bookmarkStart w:id="21" w:name="requested-action"/>
+    <w:p>
+      <w:pPr>
+        <w:pStyle w:val="Heading1"/>
+      </w:pPr>
+      <w:r>
+        <w:t xml:space="preserve">Requested action</w:t>
+      </w:r>
+    </w:p>
+    <w:p>
+      <w:pPr>
+        <w:pStyle w:val="FirstParagraph"/>
+      </w:pPr>
+      <w:r>
+        <w:t xml:space="preserve">We ask the UTC to refer this document to ESR for review and recommendation. ESR could advise that the current</w:t>
+      </w:r>
+      <w:r>
+        <w:t xml:space="preserve"> </w:t>
+      </w:r>
+      <w:r>
+        <w:t xml:space="preserve">guidance is sufficient and no further action is needed, or recommend a short public note or focused review.</w:t>
+      </w:r>
+    </w:p>
+    <w:p>
+      <w:pPr>
+        <w:pStyle w:val="BodyText"/>
+      </w:pPr>
+      <w:r>
+        <w:t xml:space="preserve">We are asking only for referral, not character encoding or bundled approval. Every candidate must still be</w:t>
+      </w:r>
+      <w:r>
+        <w:t xml:space="preserve"> </w:t>
+      </w:r>
+      <w:r>
+        <w:t xml:space="preserve">submitted through the official Emoji Submission Form and reviewed independently under Unicode’s published</w:t>
+      </w:r>
+      <w:r>
+        <w:t xml:space="preserve"> </w:t>
+      </w:r>
+      <w:r>
+        <w:t xml:space="preserve">criteria.</w:t>
+      </w:r>
+    </w:p>
+    <w:bookmarkEnd w:id="21"/>
+    <w:bookmarkStart w:id="28" w:name="references"/>
+    <w:p>
+      <w:pPr>
+        <w:pStyle w:val="Heading1"/>
+      </w:pPr>
+      <w:r>
+        <w:t xml:space="preserve">References</w:t>
       </w:r>
     </w:p>
     <w:p>
@@ -777,128 +803,6 @@
         <w:numPr>
           <w:ilvl w:val="0"/>
           <w:numId w:val="1004"/>
-        </w:numPr>
-      </w:pPr>
-      <w:r>
-        <w:t xml:space="preserve">Can someone unfamiliar with the concept identify it at common emoji sizes?</w:t>
-      </w:r>
-    </w:p>
-    <w:p>
-      <w:pPr>
-        <w:pStyle w:val="Compact"/>
-        <w:numPr>
-          <w:ilvl w:val="0"/>
-          <w:numId w:val="1004"/>
-        </w:numPr>
-      </w:pPr>
-      <w:r>
-        <w:t xml:space="preserve">Does the image retain its meaning in black and white?</w:t>
-      </w:r>
-    </w:p>
-    <w:p>
-      <w:pPr>
-        <w:pStyle w:val="Compact"/>
-        <w:numPr>
-          <w:ilvl w:val="0"/>
-          <w:numId w:val="1004"/>
-        </w:numPr>
-      </w:pPr>
-      <w:r>
-        <w:t xml:space="preserve">Is the design platform-neutral and free of text, logos, brands, or other third-party intellectual property?</w:t>
-      </w:r>
-    </w:p>
-    <w:p>
-      <w:pPr>
-        <w:pStyle w:val="Compact"/>
-        <w:numPr>
-          <w:ilvl w:val="0"/>
-          <w:numId w:val="1004"/>
-        </w:numPr>
-      </w:pPr>
-      <w:r>
-        <w:t xml:space="preserve">Would two related concepts remain distinguishable in the same emoji set?</w:t>
-      </w:r>
-    </w:p>
-    <w:p>
-      <w:pPr>
-        <w:pStyle w:val="Compact"/>
-        <w:numPr>
-          <w:ilvl w:val="0"/>
-          <w:numId w:val="1004"/>
-        </w:numPr>
-      </w:pPr>
-      <w:r>
-        <w:t xml:space="preserve">Are there implementation or interoperability concerns that ESR should consider?</w:t>
-      </w:r>
-    </w:p>
-    <w:p>
-      <w:pPr>
-        <w:pStyle w:val="FirstParagraph"/>
-      </w:pPr>
-      <w:r>
-        <w:t xml:space="preserve">Submitters remain responsible for their evidence, licensing, and the completeness of their proposals.</w:t>
-      </w:r>
-    </w:p>
-    <w:bookmarkEnd w:id="20"/>
-    <w:bookmarkStart w:id="21" w:name="requested-action"/>
-    <w:p>
-      <w:pPr>
-        <w:pStyle w:val="Heading1"/>
-      </w:pPr>
-      <w:r>
-        <w:t xml:space="preserve">Requested action</w:t>
-      </w:r>
-    </w:p>
-    <w:p>
-      <w:pPr>
-        <w:pStyle w:val="FirstParagraph"/>
-      </w:pPr>
-      <w:r>
-        <w:t xml:space="preserve">We ask the UTC to refer this document to ESR for review and recommendation. ESR could advise that the current</w:t>
-      </w:r>
-      <w:r>
-        <w:t xml:space="preserve"> </w:t>
-      </w:r>
-      <w:r>
-        <w:t xml:space="preserve">guidance is sufficient and no further action is needed, or recommend a short public note or focused review.</w:t>
-      </w:r>
-    </w:p>
-    <w:p>
-      <w:pPr>
-        <w:pStyle w:val="BodyText"/>
-      </w:pPr>
-      <w:r>
-        <w:t xml:space="preserve">We are asking only for referral, not character encoding or bundled approval. Every candidate must still be</w:t>
-      </w:r>
-      <w:r>
-        <w:t xml:space="preserve"> </w:t>
-      </w:r>
-      <w:r>
-        <w:t xml:space="preserve">submitted through the official Emoji Submission Form and reviewed independently under Unicode’s published</w:t>
-      </w:r>
-      <w:r>
-        <w:t xml:space="preserve"> </w:t>
-      </w:r>
-      <w:r>
-        <w:t xml:space="preserve">criteria.</w:t>
-      </w:r>
-    </w:p>
-    <w:bookmarkEnd w:id="21"/>
-    <w:bookmarkStart w:id="27" w:name="references"/>
-    <w:p>
-      <w:pPr>
-        <w:pStyle w:val="Heading1"/>
-      </w:pPr>
-      <w:r>
-        <w:t xml:space="preserve">References</w:t>
-      </w:r>
-    </w:p>
-    <w:p>
-      <w:pPr>
-        <w:pStyle w:val="Compact"/>
-        <w:numPr>
-          <w:ilvl w:val="0"/>
-          <w:numId w:val="1005"/>
         </w:numPr>
       </w:pPr>
       <w:r>
@@ -921,7 +825,7 @@
         <w:pStyle w:val="Compact"/>
         <w:numPr>
           <w:ilvl w:val="0"/>
-          <w:numId w:val="1005"/>
+          <w:numId w:val="1004"/>
         </w:numPr>
       </w:pPr>
       <w:r>
@@ -944,7 +848,7 @@
         <w:pStyle w:val="Compact"/>
         <w:numPr>
           <w:ilvl w:val="0"/>
-          <w:numId w:val="1005"/>
+          <w:numId w:val="1004"/>
         </w:numPr>
       </w:pPr>
       <w:r>
@@ -967,11 +871,11 @@
         <w:pStyle w:val="Compact"/>
         <w:numPr>
           <w:ilvl w:val="0"/>
-          <w:numId w:val="1005"/>
+          <w:numId w:val="1004"/>
         </w:numPr>
       </w:pPr>
       <w:r>
-        <w:t xml:space="preserve">Apple, Proposal for New Accessibility Emoji, L2/18-080:</w:t>
+        <w:t xml:space="preserve">Apple, Accessibility Emoji proposal, L2/18-080:</w:t>
       </w:r>
       <w:r>
         <w:br/>
@@ -990,26 +894,11 @@
         <w:pStyle w:val="Compact"/>
         <w:numPr>
           <w:ilvl w:val="0"/>
-          <w:numId w:val="1005"/>
+          <w:numId w:val="1004"/>
         </w:numPr>
       </w:pPr>
       <w:r>
-        <w:t xml:space="preserve">Pew Research Center,</w:t>
-      </w:r>
-      <w:r>
-        <w:t xml:space="preserve"> </w:t>
-      </w:r>
-      <w:r>
-        <w:t xml:space="preserve">“Users of social media and AI chatbots for health information are more likely to say</w:t>
-      </w:r>
-      <w:r>
-        <w:t xml:space="preserve"> </w:t>
-      </w:r>
-      <w:r>
-        <w:t xml:space="preserve">they are convenient than accurate”</w:t>
-      </w:r>
-      <w:r>
-        <w:t xml:space="preserve">:</w:t>
+        <w:t xml:space="preserve">Pew Research Center, 2026 health information survey:</w:t>
       </w:r>
       <w:r>
         <w:br/>
@@ -1028,20 +917,11 @@
         <w:pStyle w:val="Compact"/>
         <w:numPr>
           <w:ilvl w:val="0"/>
-          <w:numId w:val="1005"/>
+          <w:numId w:val="1004"/>
         </w:numPr>
       </w:pPr>
       <w:r>
-        <w:t xml:space="preserve">McKinsey &amp; Company,</w:t>
-      </w:r>
-      <w:r>
-        <w:t xml:space="preserve"> </w:t>
-      </w:r>
-      <w:r>
-        <w:t xml:space="preserve">“The Future of Wellness trends survey 2025”</w:t>
-      </w:r>
-      <w:r>
-        <w:t xml:space="preserve">:</w:t>
+        <w:t xml:space="preserve">McKinsey &amp; Company, 2025 Future of Wellness survey:</w:t>
       </w:r>
       <w:r>
         <w:br/>
@@ -1055,7 +935,30 @@
         </w:r>
       </w:hyperlink>
     </w:p>
-    <w:bookmarkEnd w:id="27"/>
+    <w:p>
+      <w:pPr>
+        <w:pStyle w:val="Compact"/>
+        <w:numPr>
+          <w:ilvl w:val="0"/>
+          <w:numId w:val="1004"/>
+        </w:numPr>
+      </w:pPr>
+      <w:r>
+        <w:t xml:space="preserve">Beatriz Costa-Gomes et al., Nature Health (2026):</w:t>
+      </w:r>
+      <w:r>
+        <w:br/>
+      </w:r>
+      <w:hyperlink r:id="rId27">
+        <w:r>
+          <w:rPr>
+            <w:rStyle w:val="Hyperlink"/>
+          </w:rPr>
+          <w:t xml:space="preserve">https://www.nature.com/articles/s44360-026-00117-x</w:t>
+        </w:r>
+      </w:hyperlink>
+    </w:p>
+    <w:bookmarkEnd w:id="28"/>
     <w:sectPr>
       <w:footnotePr>
         <w:numRestart w:val="eachSect"/>
@@ -1394,9 +1297,6 @@
     <w:abstractNumId w:val="991"/>
   </w:num>
   <w:num w:numId="1004">
-    <w:abstractNumId w:val="991"/>
-  </w:num>
-  <w:num w:numId="1005">
     <w:abstractNumId w:val="991"/>
   </w:num>
 </w:numbering>

</xml_diff>